<commit_message>
Eliminar la necesidad de Administrados en Speak al compilar x64 otros cambios recomendados por la IA en el Speak
</commit_message>
<xml_diff>
--- a/EDExplorer/Doc/EDExplorer en castellano.docx
+++ b/EDExplorer/Doc/EDExplorer en castellano.docx
@@ -1,6 +1,6 @@
 
 <file path=word/document.xml><?xml version="1.0" encoding="utf-8"?>
-<w:document xmlns:wpc="http://schemas.microsoft.com/office/word/2010/wordprocessingCanvas" xmlns:cx="http://schemas.microsoft.com/office/drawing/2014/chartex" xmlns:cx1="http://schemas.microsoft.com/office/drawing/2015/9/8/chartex" xmlns:cx2="http://schemas.microsoft.com/office/drawing/2015/10/21/chartex" xmlns:cx3="http://schemas.microsoft.com/office/drawing/2016/5/9/chartex" xmlns:cx4="http://schemas.microsoft.com/office/drawing/2016/5/10/chartex" xmlns:cx5="http://schemas.microsoft.com/office/drawing/2016/5/11/chartex" xmlns:cx6="http://schemas.microsoft.com/office/drawing/2016/5/12/chartex" xmlns:cx7="http://schemas.microsoft.com/office/drawing/2016/5/13/chartex" xmlns:cx8="http://schemas.microsoft.com/office/drawing/2016/5/14/chartex" xmlns:mc="http://schemas.openxmlformats.org/markup-compatibility/2006" xmlns:aink="http://schemas.microsoft.com/office/drawing/2016/ink" xmlns:am3d="http://schemas.microsoft.com/office/drawing/2017/model3d" xmlns:o="urn:schemas-microsoft-com:office:office" xmlns:r="http://schemas.openxmlformats.org/officeDocument/2006/relationships" xmlns:m="http://schemas.openxmlformats.org/officeDocument/2006/math" xmlns:v="urn:schemas-microsoft-com:vml" xmlns:wp14="http://schemas.microsoft.com/office/word/2010/wordprocessingDrawing" xmlns:wp="http://schemas.openxmlformats.org/drawingml/2006/wordprocessingDrawing" xmlns:w10="urn:schemas-microsoft-com:office:word" xmlns:w="http://schemas.openxmlformats.org/wordprocessingml/2006/main" xmlns:w14="http://schemas.microsoft.com/office/word/2010/wordml" xmlns:w15="http://schemas.microsoft.com/office/word/2012/wordml" xmlns:w16cex="http://schemas.microsoft.com/office/word/2018/wordml/cex" xmlns:w16cid="http://schemas.microsoft.com/office/word/2016/wordml/cid" xmlns:w16="http://schemas.microsoft.com/office/word/2018/wordml" xmlns:w16se="http://schemas.microsoft.com/office/word/2015/wordml/symex" xmlns:wpg="http://schemas.microsoft.com/office/word/2010/wordprocessingGroup" xmlns:wpi="http://schemas.microsoft.com/office/word/2010/wordprocessingInk" xmlns:wne="http://schemas.microsoft.com/office/word/2006/wordml" xmlns:wps="http://schemas.microsoft.com/office/word/2010/wordprocessingShape" mc:Ignorable="w14 w15 w16se w16cid w16 w16cex wp14">
+<w:document xmlns:wpc="http://schemas.microsoft.com/office/word/2010/wordprocessingCanvas" xmlns:cx="http://schemas.microsoft.com/office/drawing/2014/chartex" xmlns:cx1="http://schemas.microsoft.com/office/drawing/2015/9/8/chartex" xmlns:cx2="http://schemas.microsoft.com/office/drawing/2015/10/21/chartex" xmlns:cx3="http://schemas.microsoft.com/office/drawing/2016/5/9/chartex" xmlns:cx4="http://schemas.microsoft.com/office/drawing/2016/5/10/chartex" xmlns:cx5="http://schemas.microsoft.com/office/drawing/2016/5/11/chartex" xmlns:cx6="http://schemas.microsoft.com/office/drawing/2016/5/12/chartex" xmlns:cx7="http://schemas.microsoft.com/office/drawing/2016/5/13/chartex" xmlns:cx8="http://schemas.microsoft.com/office/drawing/2016/5/14/chartex" xmlns:mc="http://schemas.openxmlformats.org/markup-compatibility/2006" xmlns:aink="http://schemas.microsoft.com/office/drawing/2016/ink" xmlns:am3d="http://schemas.microsoft.com/office/drawing/2017/model3d" xmlns:o="urn:schemas-microsoft-com:office:office" xmlns:oel="http://schemas.microsoft.com/office/2019/extlst" xmlns:r="http://schemas.openxmlformats.org/officeDocument/2006/relationships" xmlns:m="http://schemas.openxmlformats.org/officeDocument/2006/math" xmlns:v="urn:schemas-microsoft-com:vml" xmlns:wp14="http://schemas.microsoft.com/office/word/2010/wordprocessingDrawing" xmlns:wp="http://schemas.openxmlformats.org/drawingml/2006/wordprocessingDrawing" xmlns:w10="urn:schemas-microsoft-com:office:word" xmlns:w="http://schemas.openxmlformats.org/wordprocessingml/2006/main" xmlns:w14="http://schemas.microsoft.com/office/word/2010/wordml" xmlns:w15="http://schemas.microsoft.com/office/word/2012/wordml" xmlns:w16cex="http://schemas.microsoft.com/office/word/2018/wordml/cex" xmlns:w16cid="http://schemas.microsoft.com/office/word/2016/wordml/cid" xmlns:w16="http://schemas.microsoft.com/office/word/2018/wordml" xmlns:w16du="http://schemas.microsoft.com/office/word/2023/wordml/word16du" xmlns:w16sdtdh="http://schemas.microsoft.com/office/word/2020/wordml/sdtdatahash" xmlns:w16sdtfl="http://schemas.microsoft.com/office/word/2024/wordml/sdtformatlock" xmlns:w16se="http://schemas.microsoft.com/office/word/2015/wordml/symex" xmlns:wpg="http://schemas.microsoft.com/office/word/2010/wordprocessingGroup" xmlns:wpi="http://schemas.microsoft.com/office/word/2010/wordprocessingInk" xmlns:wne="http://schemas.microsoft.com/office/word/2006/wordml" xmlns:wps="http://schemas.microsoft.com/office/word/2010/wordprocessingShape" mc:Ignorable="w14 w15 w16se w16cid w16 w16cex w16sdtdh w16sdtfl w16du wp14">
   <w:body>
     <w:p>
       <w:proofErr w:type="spellStart"/>
@@ -39,6 +39,9 @@
     </w:p>
     <w:p>
       <w:r>
+        <w:rPr>
+          <w:noProof/>
+        </w:rPr>
         <w:drawing>
           <wp:inline distT="0" distB="0" distL="0" distR="0" wp14:anchorId="2849F99B" wp14:editId="0FC8C305">
             <wp:extent cx="1170940" cy="1030605"/>
@@ -120,6 +123,9 @@
     </w:p>
     <w:p>
       <w:r>
+        <w:rPr>
+          <w:noProof/>
+        </w:rPr>
         <w:drawing>
           <wp:inline distT="0" distB="0" distL="0" distR="0" wp14:anchorId="38F98AA6" wp14:editId="7EAA5FE3">
             <wp:extent cx="4239260" cy="2887345"/>
@@ -178,6 +184,9 @@
     </w:p>
     <w:p>
       <w:r>
+        <w:rPr>
+          <w:noProof/>
+        </w:rPr>
         <w:drawing>
           <wp:inline distT="0" distB="0" distL="0" distR="0" wp14:anchorId="5848C5E4" wp14:editId="1F764D0D">
             <wp:extent cx="5400040" cy="2148840"/>
@@ -236,6 +245,9 @@
     </w:p>
     <w:p>
       <w:r>
+        <w:rPr>
+          <w:noProof/>
+        </w:rPr>
         <w:lastRenderedPageBreak/>
         <w:drawing>
           <wp:inline distT="0" distB="0" distL="0" distR="0" wp14:anchorId="7ADC8F85" wp14:editId="7F060F5F">
@@ -303,6 +315,9 @@
     </w:p>
     <w:p>
       <w:r>
+        <w:rPr>
+          <w:noProof/>
+        </w:rPr>
         <w:drawing>
           <wp:inline distT="0" distB="0" distL="0" distR="0" wp14:anchorId="7A7ADD65" wp14:editId="3508D19F">
             <wp:extent cx="2819400" cy="1255395"/>
@@ -368,15 +383,7 @@
       </w:r>
       <w:proofErr w:type="spellEnd"/>
       <w:r>
-        <w:t xml:space="preserve"> activa del </w:t>
-      </w:r>
-      <w:proofErr w:type="spellStart"/>
-      <w:r>
-        <w:t>Journal</w:t>
-      </w:r>
-      <w:proofErr w:type="spellEnd"/>
-      <w:r>
-        <w:t xml:space="preserve"> de ED</w:t>
+        <w:t xml:space="preserve"> activa del Journal de ED</w:t>
       </w:r>
       <w:r>
         <w:br/>
@@ -510,15 +517,7 @@
       </w:r>
       <w:proofErr w:type="spellEnd"/>
       <w:r>
-        <w:t xml:space="preserve"> el inventario de las funcionalidades que se están desarrollando, por si alguien quiere colaborar en el testeo de la misma (existe icono con las diferentes </w:t>
-      </w:r>
-      <w:proofErr w:type="spellStart"/>
-      <w:r>
-        <w:t>Releases</w:t>
-      </w:r>
-      <w:proofErr w:type="spellEnd"/>
-      <w:r>
-        <w:t xml:space="preserve"> e incluyen una pequeña descripción de las funcionalidades incluidas en la misma). Se puede consultar en el siguiente enlace:</w:t>
+        <w:t xml:space="preserve"> el inventario de las funcionalidades que se están desarrollando, por si alguien quiere colaborar en el testeo de la misma (existe icono con las diferentes Releases e incluyen una pequeña descripción de las funcionalidades incluidas en la misma). Se puede consultar en el siguiente enlace:</w:t>
       </w:r>
       <w:r>
         <w:br/>
@@ -583,15 +582,7 @@
         </w:numPr>
       </w:pPr>
       <w:r>
-        <w:t xml:space="preserve">Análisis del historial de los Logs locales en la búsqueda de </w:t>
-      </w:r>
-      <w:proofErr w:type="spellStart"/>
-      <w:r>
-        <w:t>Records</w:t>
-      </w:r>
-      <w:proofErr w:type="spellEnd"/>
-      <w:r>
-        <w:t xml:space="preserve"> personales.</w:t>
+        <w:t>Análisis del historial de los Logs locales en la búsqueda de Records personales.</w:t>
       </w:r>
     </w:p>
     <w:p>
@@ -622,6 +613,434 @@
         <w:t>, por ayudarme a probarla.</w:t>
       </w:r>
     </w:p>
+    <w:p>
+      <w:r>
+        <w:br w:type="page"/>
+      </w:r>
+    </w:p>
+    <w:p>
+      <w:r>
+        <w:lastRenderedPageBreak/>
+        <w:t xml:space="preserve">Esta aplicación, </w:t>
+      </w:r>
+      <w:proofErr w:type="spellStart"/>
+      <w:r>
+        <w:rPr>
+          <w:u w:val="single"/>
+        </w:rPr>
+        <w:t>EDExplorer</w:t>
+      </w:r>
+      <w:proofErr w:type="spellEnd"/>
+      <w:r>
+        <w:t xml:space="preserve">, es una herramienta de monitorización y notificación para el juego Elite </w:t>
+      </w:r>
+      <w:proofErr w:type="spellStart"/>
+      <w:r>
+        <w:t>Dangerous</w:t>
+      </w:r>
+      <w:proofErr w:type="spellEnd"/>
+      <w:r>
+        <w:t>. Resumen breve de lo que hace y cómo funciona:</w:t>
+      </w:r>
+    </w:p>
+    <w:p>
+      <w:pPr>
+        <w:numPr>
+          <w:ilvl w:val="0"/>
+          <w:numId w:val="4"/>
+        </w:numPr>
+      </w:pPr>
+      <w:r>
+        <w:t>Vigila los ficheros de diario (</w:t>
+      </w:r>
+      <w:proofErr w:type="spellStart"/>
+      <w:r>
+        <w:t>journal</w:t>
+      </w:r>
+      <w:proofErr w:type="spellEnd"/>
+      <w:r>
+        <w:t xml:space="preserve">) del juego usando </w:t>
+      </w:r>
+      <w:proofErr w:type="spellStart"/>
+      <w:r>
+        <w:rPr>
+          <w:b/>
+        </w:rPr>
+        <w:t>FileSystemWatcher</w:t>
+      </w:r>
+      <w:proofErr w:type="spellEnd"/>
+      <w:r>
+        <w:t xml:space="preserve"> (ruta por defecto: </w:t>
+      </w:r>
+      <w:proofErr w:type="spellStart"/>
+      <w:r>
+        <w:rPr>
+          <w:b/>
+        </w:rPr>
+        <w:t>Saved</w:t>
+      </w:r>
+      <w:proofErr w:type="spellEnd"/>
+      <w:r>
+        <w:rPr>
+          <w:b/>
+        </w:rPr>
+        <w:t xml:space="preserve"> Games\</w:t>
+      </w:r>
+      <w:proofErr w:type="spellStart"/>
+      <w:r>
+        <w:rPr>
+          <w:b/>
+        </w:rPr>
+        <w:t>Frontier</w:t>
+      </w:r>
+      <w:proofErr w:type="spellEnd"/>
+      <w:r>
+        <w:rPr>
+          <w:b/>
+        </w:rPr>
+        <w:t xml:space="preserve"> </w:t>
+      </w:r>
+      <w:proofErr w:type="spellStart"/>
+      <w:r>
+        <w:rPr>
+          <w:b/>
+        </w:rPr>
+        <w:t>Developments</w:t>
+      </w:r>
+      <w:proofErr w:type="spellEnd"/>
+      <w:r>
+        <w:rPr>
+          <w:b/>
+        </w:rPr>
+        <w:t xml:space="preserve">\Elite </w:t>
+      </w:r>
+      <w:proofErr w:type="spellStart"/>
+      <w:r>
+        <w:rPr>
+          <w:b/>
+        </w:rPr>
+        <w:t>Dangerous</w:t>
+      </w:r>
+      <w:proofErr w:type="spellEnd"/>
+      <w:r>
+        <w:t>) y lee nuevas líneas JSON. (</w:t>
+      </w:r>
+      <w:proofErr w:type="spellStart"/>
+      <w:r>
+        <w:rPr>
+          <w:u w:val="single"/>
+        </w:rPr>
+        <w:t>LogMonitor</w:t>
+      </w:r>
+      <w:proofErr w:type="spellEnd"/>
+      <w:r>
+        <w:t>).</w:t>
+      </w:r>
+    </w:p>
+    <w:p>
+      <w:pPr>
+        <w:numPr>
+          <w:ilvl w:val="0"/>
+          <w:numId w:val="4"/>
+        </w:numPr>
+      </w:pPr>
+      <w:proofErr w:type="spellStart"/>
+      <w:r>
+        <w:t>Parsea</w:t>
+      </w:r>
+      <w:proofErr w:type="spellEnd"/>
+      <w:r>
+        <w:t xml:space="preserve"> eventos de diario relevantes (por </w:t>
+      </w:r>
+      <w:proofErr w:type="gramStart"/>
+      <w:r>
+        <w:t>ejemplo</w:t>
+      </w:r>
+      <w:proofErr w:type="gramEnd"/>
+      <w:r>
+        <w:t xml:space="preserve"> </w:t>
+      </w:r>
+      <w:r>
+        <w:rPr>
+          <w:u w:val="single"/>
+        </w:rPr>
+        <w:t>Scan</w:t>
+      </w:r>
+      <w:r>
+        <w:t xml:space="preserve">, </w:t>
+      </w:r>
+      <w:proofErr w:type="spellStart"/>
+      <w:r>
+        <w:rPr>
+          <w:u w:val="single"/>
+        </w:rPr>
+        <w:t>FSDJump</w:t>
+      </w:r>
+      <w:proofErr w:type="spellEnd"/>
+      <w:r>
+        <w:t xml:space="preserve">, </w:t>
+      </w:r>
+      <w:proofErr w:type="spellStart"/>
+      <w:r>
+        <w:rPr>
+          <w:u w:val="single"/>
+        </w:rPr>
+        <w:t>SAASignalsFound</w:t>
+      </w:r>
+      <w:proofErr w:type="spellEnd"/>
+      <w:r>
+        <w:t xml:space="preserve">, </w:t>
+      </w:r>
+      <w:proofErr w:type="spellStart"/>
+      <w:r>
+        <w:rPr>
+          <w:u w:val="single"/>
+        </w:rPr>
+        <w:t>FSSDiscoveryScan</w:t>
+      </w:r>
+      <w:proofErr w:type="spellEnd"/>
+      <w:r>
+        <w:t xml:space="preserve">, </w:t>
+      </w:r>
+      <w:proofErr w:type="spellStart"/>
+      <w:r>
+        <w:rPr>
+          <w:b/>
+        </w:rPr>
+        <w:t>StartJump</w:t>
+      </w:r>
+      <w:proofErr w:type="spellEnd"/>
+      <w:r>
+        <w:t xml:space="preserve">, </w:t>
+      </w:r>
+      <w:proofErr w:type="spellStart"/>
+      <w:r>
+        <w:rPr>
+          <w:b/>
+        </w:rPr>
+        <w:t>FSDTarget</w:t>
+      </w:r>
+      <w:proofErr w:type="spellEnd"/>
+      <w:r>
+        <w:t>, etc.) y los convierte en objetos con los que trabaja internamente.</w:t>
+      </w:r>
+    </w:p>
+    <w:p>
+      <w:pPr>
+        <w:numPr>
+          <w:ilvl w:val="0"/>
+          <w:numId w:val="4"/>
+        </w:numPr>
+      </w:pPr>
+      <w:r>
+        <w:t>Clasifica y cachea información por sistema y cuerpo (escaneos, señales, descubrimientos) para detectar sucesos interesantes o "alertas". (</w:t>
+      </w:r>
+      <w:proofErr w:type="spellStart"/>
+      <w:r>
+        <w:rPr>
+          <w:u w:val="single"/>
+        </w:rPr>
+        <w:t>SystemBody</w:t>
+      </w:r>
+      <w:proofErr w:type="spellEnd"/>
+      <w:r>
+        <w:t xml:space="preserve">, </w:t>
+      </w:r>
+      <w:proofErr w:type="spellStart"/>
+      <w:r>
+        <w:rPr>
+          <w:u w:val="single"/>
+        </w:rPr>
+        <w:t>SystemBodySignal</w:t>
+      </w:r>
+      <w:proofErr w:type="spellEnd"/>
+      <w:r>
+        <w:t xml:space="preserve">, </w:t>
+      </w:r>
+      <w:r>
+        <w:rPr>
+          <w:u w:val="single"/>
+        </w:rPr>
+        <w:t>Alertas</w:t>
+      </w:r>
+      <w:r>
+        <w:t>).</w:t>
+      </w:r>
+    </w:p>
+    <w:p>
+      <w:pPr>
+        <w:numPr>
+          <w:ilvl w:val="0"/>
+          <w:numId w:val="4"/>
+        </w:numPr>
+      </w:pPr>
+      <w:r>
+        <w:t xml:space="preserve">Genera notificaciones en pantalla y/o salida de audio mediante </w:t>
+      </w:r>
+      <w:proofErr w:type="spellStart"/>
+      <w:r>
+        <w:rPr>
+          <w:b/>
+        </w:rPr>
+        <w:t>SpeechSynthesizer</w:t>
+      </w:r>
+      <w:proofErr w:type="spellEnd"/>
+      <w:r>
+        <w:t xml:space="preserve"> cuando se detectan alertas o resúmenes de sesión. (</w:t>
+      </w:r>
+      <w:proofErr w:type="spellStart"/>
+      <w:r>
+        <w:rPr>
+          <w:u w:val="single"/>
+        </w:rPr>
+        <w:t>Base.AnnounceItems</w:t>
+      </w:r>
+      <w:proofErr w:type="spellEnd"/>
+      <w:r>
+        <w:t xml:space="preserve">, </w:t>
+      </w:r>
+      <w:proofErr w:type="spellStart"/>
+      <w:r>
+        <w:rPr>
+          <w:u w:val="single"/>
+        </w:rPr>
+        <w:t>ResumenSesion</w:t>
+      </w:r>
+      <w:proofErr w:type="spellEnd"/>
+      <w:r>
+        <w:t>).</w:t>
+      </w:r>
+    </w:p>
+    <w:p>
+      <w:pPr>
+        <w:numPr>
+          <w:ilvl w:val="0"/>
+          <w:numId w:val="4"/>
+        </w:numPr>
+      </w:pPr>
+      <w:r>
+        <w:t xml:space="preserve">Muestra una interfaz gráfica con listado de eventos detectados y filtros (clase </w:t>
+      </w:r>
+      <w:proofErr w:type="spellStart"/>
+      <w:r>
+        <w:rPr>
+          <w:u w:val="single"/>
+        </w:rPr>
+        <w:t>EDExplorerFrm</w:t>
+      </w:r>
+      <w:proofErr w:type="spellEnd"/>
+      <w:r>
+        <w:t xml:space="preserve">): permite ver, filtrar, copiar y navegar los eventos detectados, así como leer históricos (leer últimos N </w:t>
+      </w:r>
+      <w:proofErr w:type="spellStart"/>
+      <w:r>
+        <w:t>journal</w:t>
+      </w:r>
+      <w:proofErr w:type="spellEnd"/>
+      <w:r>
+        <w:t xml:space="preserve"> files).</w:t>
+      </w:r>
+    </w:p>
+    <w:p>
+      <w:pPr>
+        <w:numPr>
+          <w:ilvl w:val="0"/>
+          <w:numId w:val="4"/>
+        </w:numPr>
+      </w:pPr>
+      <w:r>
+        <w:t xml:space="preserve">Permite leer todo el histórico (modo </w:t>
+      </w:r>
+      <w:proofErr w:type="spellStart"/>
+      <w:r>
+        <w:rPr>
+          <w:u w:val="single"/>
+        </w:rPr>
+        <w:t>ReadAll</w:t>
+      </w:r>
+      <w:proofErr w:type="spellEnd"/>
+      <w:r>
+        <w:t>) para reconstruir el estado y mostrar alertas pasadas.</w:t>
+      </w:r>
+    </w:p>
+    <w:p>
+      <w:pPr>
+        <w:numPr>
+          <w:ilvl w:val="0"/>
+          <w:numId w:val="4"/>
+        </w:numPr>
+      </w:pPr>
+      <w:r>
+        <w:t xml:space="preserve">Tiene configuración persistente en </w:t>
+      </w:r>
+      <w:proofErr w:type="spellStart"/>
+      <w:r>
+        <w:rPr>
+          <w:u w:val="single"/>
+        </w:rPr>
+        <w:t>Properties.Settings</w:t>
+      </w:r>
+      <w:proofErr w:type="spellEnd"/>
+      <w:r>
+        <w:t xml:space="preserve"> (activar audio, notificaciones, rutas, número de diarios a leer, etc.).</w:t>
+      </w:r>
+    </w:p>
+    <w:p>
+      <w:pPr>
+        <w:numPr>
+          <w:ilvl w:val="0"/>
+          <w:numId w:val="4"/>
+        </w:numPr>
+      </w:pPr>
+      <w:r>
+        <w:t xml:space="preserve">El </w:t>
+      </w:r>
+      <w:proofErr w:type="spellStart"/>
+      <w:r>
+        <w:t>build</w:t>
+      </w:r>
+      <w:proofErr w:type="spellEnd"/>
+      <w:r>
+        <w:t xml:space="preserve"> final empaqueta dependencias (por </w:t>
+      </w:r>
+      <w:proofErr w:type="gramStart"/>
+      <w:r>
+        <w:t>ejemplo</w:t>
+      </w:r>
+      <w:proofErr w:type="gramEnd"/>
+      <w:r>
+        <w:t xml:space="preserve"> </w:t>
+      </w:r>
+      <w:proofErr w:type="spellStart"/>
+      <w:r>
+        <w:rPr>
+          <w:b/>
+        </w:rPr>
+        <w:t>Newtonsoft.Json</w:t>
+      </w:r>
+      <w:proofErr w:type="spellEnd"/>
+      <w:r>
+        <w:t xml:space="preserve">) en un único EXE mediante </w:t>
+      </w:r>
+      <w:proofErr w:type="spellStart"/>
+      <w:r>
+        <w:t>ILRepack</w:t>
+      </w:r>
+      <w:proofErr w:type="spellEnd"/>
+      <w:r>
+        <w:t xml:space="preserve"> (por eso ves </w:t>
+      </w:r>
+      <w:r>
+        <w:rPr>
+          <w:b/>
+        </w:rPr>
+        <w:t>EDExplorer2026.exe</w:t>
+      </w:r>
+      <w:r>
+        <w:t>).</w:t>
+      </w:r>
+    </w:p>
+    <w:p/>
     <w:sectPr>
       <w:pgSz w:w="11906" w:h="16838"/>
       <w:pgMar w:top="1417" w:right="1701" w:bottom="1417" w:left="1701" w:header="708" w:footer="708" w:gutter="0"/>
@@ -633,8 +1052,18 @@
 </file>
 
 <file path=word/numbering.xml><?xml version="1.0" encoding="utf-8"?>
-<w:numbering xmlns:wpc="http://schemas.microsoft.com/office/word/2010/wordprocessingCanvas" xmlns:cx="http://schemas.microsoft.com/office/drawing/2014/chartex" xmlns:cx1="http://schemas.microsoft.com/office/drawing/2015/9/8/chartex" xmlns:cx2="http://schemas.microsoft.com/office/drawing/2015/10/21/chartex" xmlns:cx3="http://schemas.microsoft.com/office/drawing/2016/5/9/chartex" xmlns:cx4="http://schemas.microsoft.com/office/drawing/2016/5/10/chartex" xmlns:cx5="http://schemas.microsoft.com/office/drawing/2016/5/11/chartex" xmlns:cx6="http://schemas.microsoft.com/office/drawing/2016/5/12/chartex" xmlns:cx7="http://schemas.microsoft.com/office/drawing/2016/5/13/chartex" xmlns:cx8="http://schemas.microsoft.com/office/drawing/2016/5/14/chartex" xmlns:mc="http://schemas.openxmlformats.org/markup-compatibility/2006" xmlns:aink="http://schemas.microsoft.com/office/drawing/2016/ink" xmlns:am3d="http://schemas.microsoft.com/office/drawing/2017/model3d" xmlns:o="urn:schemas-microsoft-com:office:office" xmlns:r="http://schemas.openxmlformats.org/officeDocument/2006/relationships" xmlns:m="http://schemas.openxmlformats.org/officeDocument/2006/math" xmlns:v="urn:schemas-microsoft-com:vml" xmlns:wp14="http://schemas.microsoft.com/office/word/2010/wordprocessingDrawing" xmlns:wp="http://schemas.openxmlformats.org/drawingml/2006/wordprocessingDrawing" xmlns:w10="urn:schemas-microsoft-com:office:word" xmlns:w="http://schemas.openxmlformats.org/wordprocessingml/2006/main" xmlns:w14="http://schemas.microsoft.com/office/word/2010/wordml" xmlns:w15="http://schemas.microsoft.com/office/word/2012/wordml" xmlns:w16cex="http://schemas.microsoft.com/office/word/2018/wordml/cex" xmlns:w16cid="http://schemas.microsoft.com/office/word/2016/wordml/cid" xmlns:w16="http://schemas.microsoft.com/office/word/2018/wordml" xmlns:w16se="http://schemas.microsoft.com/office/word/2015/wordml/symex" xmlns:wpg="http://schemas.microsoft.com/office/word/2010/wordprocessingGroup" xmlns:wpi="http://schemas.microsoft.com/office/word/2010/wordprocessingInk" xmlns:wne="http://schemas.microsoft.com/office/word/2006/wordml" xmlns:wps="http://schemas.microsoft.com/office/word/2010/wordprocessingShape" mc:Ignorable="w14 w15 w16se w16cid w16 w16cex wp14">
+<w:numbering xmlns:wpc="http://schemas.microsoft.com/office/word/2010/wordprocessingCanvas" xmlns:cx="http://schemas.microsoft.com/office/drawing/2014/chartex" xmlns:cx1="http://schemas.microsoft.com/office/drawing/2015/9/8/chartex" xmlns:cx2="http://schemas.microsoft.com/office/drawing/2015/10/21/chartex" xmlns:cx3="http://schemas.microsoft.com/office/drawing/2016/5/9/chartex" xmlns:cx4="http://schemas.microsoft.com/office/drawing/2016/5/10/chartex" xmlns:cx5="http://schemas.microsoft.com/office/drawing/2016/5/11/chartex" xmlns:cx6="http://schemas.microsoft.com/office/drawing/2016/5/12/chartex" xmlns:cx7="http://schemas.microsoft.com/office/drawing/2016/5/13/chartex" xmlns:cx8="http://schemas.microsoft.com/office/drawing/2016/5/14/chartex" xmlns:mc="http://schemas.openxmlformats.org/markup-compatibility/2006" xmlns:aink="http://schemas.microsoft.com/office/drawing/2016/ink" xmlns:am3d="http://schemas.microsoft.com/office/drawing/2017/model3d" xmlns:o="urn:schemas-microsoft-com:office:office" xmlns:oel="http://schemas.microsoft.com/office/2019/extlst" xmlns:r="http://schemas.openxmlformats.org/officeDocument/2006/relationships" xmlns:m="http://schemas.openxmlformats.org/officeDocument/2006/math" xmlns:v="urn:schemas-microsoft-com:vml" xmlns:wp14="http://schemas.microsoft.com/office/word/2010/wordprocessingDrawing" xmlns:wp="http://schemas.openxmlformats.org/drawingml/2006/wordprocessingDrawing" xmlns:w10="urn:schemas-microsoft-com:office:word" xmlns:w="http://schemas.openxmlformats.org/wordprocessingml/2006/main" xmlns:w14="http://schemas.microsoft.com/office/word/2010/wordml" xmlns:w15="http://schemas.microsoft.com/office/word/2012/wordml" xmlns:w16cex="http://schemas.microsoft.com/office/word/2018/wordml/cex" xmlns:w16cid="http://schemas.microsoft.com/office/word/2016/wordml/cid" xmlns:w16="http://schemas.microsoft.com/office/word/2018/wordml" xmlns:w16du="http://schemas.microsoft.com/office/word/2023/wordml/word16du" xmlns:w16sdtdh="http://schemas.microsoft.com/office/word/2020/wordml/sdtdatahash" xmlns:w16sdtfl="http://schemas.microsoft.com/office/word/2024/wordml/sdtformatlock" xmlns:w16se="http://schemas.microsoft.com/office/word/2015/wordml/symex" xmlns:wpg="http://schemas.microsoft.com/office/word/2010/wordprocessingGroup" xmlns:wpi="http://schemas.microsoft.com/office/word/2010/wordprocessingInk" xmlns:wne="http://schemas.microsoft.com/office/word/2006/wordml" xmlns:wps="http://schemas.microsoft.com/office/word/2010/wordprocessingShape" mc:Ignorable="w14 w15 w16se w16cid w16 w16cex w16sdtdh w16sdtfl w16du wp14">
   <w:abstractNum w:abstractNumId="0" w15:restartNumberingAfterBreak="0">
+    <w:nsid w:val="FFFFFFFE"/>
+    <w:multiLevelType w:val="singleLevel"/>
+    <w:tmpl w:val="EE7A64DC"/>
+    <w:lvl w:ilvl="0">
+      <w:numFmt w:val="bullet"/>
+      <w:lvlText w:val="*"/>
+      <w:lvlJc w:val="left"/>
+    </w:lvl>
+  </w:abstractNum>
+  <w:abstractNum w:abstractNumId="1" w15:restartNumberingAfterBreak="0">
     <w:nsid w:val="0BAD20BB"/>
     <w:multiLevelType w:val="multilevel"/>
     <w:tmpl w:val="A30EBEB0"/>
@@ -783,7 +1212,7 @@
       </w:rPr>
     </w:lvl>
   </w:abstractNum>
-  <w:abstractNum w:abstractNumId="1" w15:restartNumberingAfterBreak="0">
+  <w:abstractNum w:abstractNumId="2" w15:restartNumberingAfterBreak="0">
     <w:nsid w:val="444671F4"/>
     <w:multiLevelType w:val="hybridMultilevel"/>
     <w:tmpl w:val="7F44F122"/>
@@ -895,7 +1324,7 @@
       </w:rPr>
     </w:lvl>
   </w:abstractNum>
-  <w:abstractNum w:abstractNumId="2" w15:restartNumberingAfterBreak="0">
+  <w:abstractNum w:abstractNumId="3" w15:restartNumberingAfterBreak="0">
     <w:nsid w:val="4FCE54B8"/>
     <w:multiLevelType w:val="multilevel"/>
     <w:tmpl w:val="A3547D26"/>
@@ -1044,20 +1473,35 @@
       </w:rPr>
     </w:lvl>
   </w:abstractNum>
-  <w:num w:numId="1">
+  <w:num w:numId="1" w16cid:durableId="4594310">
+    <w:abstractNumId w:val="2"/>
+  </w:num>
+  <w:num w:numId="2" w16cid:durableId="1966541356">
     <w:abstractNumId w:val="1"/>
   </w:num>
-  <w:num w:numId="2">
+  <w:num w:numId="3" w16cid:durableId="1914193808">
+    <w:abstractNumId w:val="3"/>
+  </w:num>
+  <w:num w:numId="4" w16cid:durableId="1779832992">
     <w:abstractNumId w:val="0"/>
-  </w:num>
-  <w:num w:numId="3">
-    <w:abstractNumId w:val="2"/>
+    <w:lvlOverride w:ilvl="0">
+      <w:lvl w:ilvl="0">
+        <w:start w:val="1"/>
+        <w:numFmt w:val="bullet"/>
+        <w:lvlText w:val="·"/>
+        <w:legacy w:legacy="1" w:legacySpace="0" w:legacyIndent="0"/>
+        <w:lvlJc w:val="left"/>
+        <w:rPr>
+          <w:rFonts w:ascii="Times New Roman" w:hAnsi="Times New Roman" w:cs="Times New Roman" w:hint="default"/>
+        </w:rPr>
+      </w:lvl>
+    </w:lvlOverride>
   </w:num>
 </w:numbering>
 </file>
 
 <file path=word/styles.xml><?xml version="1.0" encoding="utf-8"?>
-<w:styles xmlns:mc="http://schemas.openxmlformats.org/markup-compatibility/2006" xmlns:r="http://schemas.openxmlformats.org/officeDocument/2006/relationships" xmlns:w="http://schemas.openxmlformats.org/wordprocessingml/2006/main" xmlns:w14="http://schemas.microsoft.com/office/word/2010/wordml" xmlns:w15="http://schemas.microsoft.com/office/word/2012/wordml" xmlns:w16cex="http://schemas.microsoft.com/office/word/2018/wordml/cex" xmlns:w16cid="http://schemas.microsoft.com/office/word/2016/wordml/cid" xmlns:w16="http://schemas.microsoft.com/office/word/2018/wordml" xmlns:w16se="http://schemas.microsoft.com/office/word/2015/wordml/symex" mc:Ignorable="w14 w15 w16se w16cid w16 w16cex">
+<w:styles xmlns:mc="http://schemas.openxmlformats.org/markup-compatibility/2006" xmlns:r="http://schemas.openxmlformats.org/officeDocument/2006/relationships" xmlns:w="http://schemas.openxmlformats.org/wordprocessingml/2006/main" xmlns:w14="http://schemas.microsoft.com/office/word/2010/wordml" xmlns:w15="http://schemas.microsoft.com/office/word/2012/wordml" xmlns:w16cex="http://schemas.microsoft.com/office/word/2018/wordml/cex" xmlns:w16cid="http://schemas.microsoft.com/office/word/2016/wordml/cid" xmlns:w16="http://schemas.microsoft.com/office/word/2018/wordml" xmlns:w16du="http://schemas.microsoft.com/office/word/2023/wordml/word16du" xmlns:w16sdtdh="http://schemas.microsoft.com/office/word/2020/wordml/sdtdatahash" xmlns:w16sdtfl="http://schemas.microsoft.com/office/word/2024/wordml/sdtformatlock" xmlns:w16se="http://schemas.microsoft.com/office/word/2015/wordml/symex" mc:Ignorable="w14 w15 w16se w16cid w16 w16cex w16sdtdh w16sdtfl w16du">
   <w:docDefaults>
     <w:rPrDefault>
       <w:rPr>
@@ -1179,6 +1623,7 @@
     <w:lsdException w:name="HTML Sample" w:semiHidden="1" w:unhideWhenUsed="1"/>
     <w:lsdException w:name="HTML Typewriter" w:semiHidden="1" w:unhideWhenUsed="1"/>
     <w:lsdException w:name="HTML Variable" w:semiHidden="1" w:unhideWhenUsed="1"/>
+    <w:lsdException w:name="Normal Table" w:semiHidden="1" w:unhideWhenUsed="1"/>
     <w:lsdException w:name="annotation subject" w:semiHidden="1" w:unhideWhenUsed="1"/>
     <w:lsdException w:name="No List" w:semiHidden="1" w:unhideWhenUsed="1"/>
     <w:lsdException w:name="Outline List 1" w:semiHidden="1" w:unhideWhenUsed="1"/>
@@ -1225,8 +1670,10 @@
     <w:lsdException w:name="Table Subtle 2" w:semiHidden="1" w:unhideWhenUsed="1"/>
     <w:lsdException w:name="Table Web 1" w:semiHidden="1" w:unhideWhenUsed="1"/>
     <w:lsdException w:name="Table Web 2" w:semiHidden="1" w:unhideWhenUsed="1"/>
+    <w:lsdException w:name="Table Web 3" w:semiHidden="1" w:unhideWhenUsed="1"/>
     <w:lsdException w:name="Balloon Text" w:semiHidden="1" w:unhideWhenUsed="1"/>
     <w:lsdException w:name="Table Grid" w:uiPriority="39"/>
+    <w:lsdException w:name="Table Theme" w:semiHidden="1" w:unhideWhenUsed="1"/>
     <w:lsdException w:name="Placeholder Text" w:semiHidden="1"/>
     <w:lsdException w:name="No Spacing" w:uiPriority="1" w:qFormat="1"/>
     <w:lsdException w:name="Light Shading" w:uiPriority="60"/>

</xml_diff>